<commit_message>
fix(docs): align schema, seniority exception, graduated scoring, Remotive terms, and board lists with exact codebase
</commit_message>
<xml_diff>
--- a/docs/Job_Digest_Master_Architecture_Report.docx
+++ b/docs/Job_Digest_Master_Architecture_Report.docx
@@ -165,7 +165,7 @@
           <w:color w:val="334155"/>
           <w:sz w:val="20"/>
         </w:rPr>
-        <w:t>Strictly excludes Senior, Lead, Principal, Staff, Architect, Manager, and Director positions.</w:t>
+        <w:t>Strictly excludes Senior, Lead, Principal, Staff, Architect, Manager, and Director positions for standard roles. Intelligent false-positive guard preserves roles like 'Product Manager Intern' or 'Lead Generation Trainee'.</w:t>
       </w:r>
     </w:p>
     <w:p>
@@ -2195,7 +2195,7 @@
           <w:color w:val="0F172A"/>
           <w:sz w:val="28"/>
         </w:rPr>
-        <w:t>3. All Ingestion Websites &amp; API Endpoints (10 Sources)</w:t>
+        <w:t>3. All Ingestion Websites &amp; API Endpoints (10 Sources • 57 Company Boards)</w:t>
       </w:r>
     </w:p>
     <w:tbl>
@@ -2414,7 +2414,7 @@
                 <w:color w:val="334155"/>
                 <w:sz w:val="18"/>
               </w:rPr>
-              <w:t>24 Boards: Groww, InMobi, Twilio, Rubrik, Databricks, Okta, Stripe, etc.</w:t>
+              <w:t>26 Boards: Cloudflare, Stripe, Datadog, Reddit, MongoDB, Airbnb, Groww, InMobi, Twilio, Databricks, Okta, etc.</w:t>
             </w:r>
           </w:p>
         </w:tc>
@@ -2516,7 +2516,7 @@
                 <w:color w:val="334155"/>
                 <w:sz w:val="18"/>
               </w:rPr>
-              <w:t>8 Boards: CRED, Meesho, Atlan, Postman, Hotstar, Urban Company, BrowserStack</w:t>
+              <w:t>10 Boards: CRED, Meesho, Palantir, Spotify, Lever, Canonical, Postman, Linear, Docker, BrowserStack</w:t>
             </w:r>
           </w:p>
         </w:tc>
@@ -2618,7 +2618,7 @@
                 <w:color w:val="334155"/>
                 <w:sz w:val="18"/>
               </w:rPr>
-              <w:t>4 Boards: Snowflake, Linear, Replit, Vercel (isListed=True)</w:t>
+              <w:t>9 Boards: OpenAI, Retool, Ramp, Anthropic, Notion, Figma, Linear, Monzo, Snowflake</w:t>
             </w:r>
           </w:p>
         </w:tc>
@@ -2720,7 +2720,7 @@
                 <w:color w:val="334155"/>
                 <w:sz w:val="18"/>
               </w:rPr>
-              <w:t>14 Boards: Swiggy, Freshworks, Cars24, Grab, Visa, Spotify, Square, etc.</w:t>
+              <w:t>8 Boards: Swiggy, Freshworks, Cars24, Grab, BoschGroup, IKEA, Ubisoft, Visa</w:t>
             </w:r>
           </w:p>
         </w:tc>
@@ -2822,7 +2822,7 @@
                 <w:color w:val="334155"/>
                 <w:sz w:val="18"/>
               </w:rPr>
-              <w:t>7 Boards: Hasura, InVideo, Scaler, Cult.fit, Curefit, etc.</w:t>
+              <w:t>4 Boards: Transferwise, Harness, TestGorilla, Farfetch</w:t>
             </w:r>
           </w:p>
         </w:tc>
@@ -3128,7 +3128,7 @@
                 <w:color w:val="334155"/>
                 <w:sz w:val="18"/>
               </w:rPr>
-              <w:t>Remote tech listings, rate-capped at &lt;= 4/day to prevent dilution</w:t>
+              <w:t>Remote tech feed; strictly limited to max 4 daily fetches to obey API terms</w:t>
             </w:r>
           </w:p>
         </w:tc>
@@ -3332,7 +3332,7 @@
                 <w:color w:val="334155"/>
                 <w:sz w:val="18"/>
               </w:rPr>
-              <w:t>Whitelisted platforms (LinkedIn, Naukri, Indeed) + Direct ATS domains</w:t>
+              <w:t>Whitelisted platforms (LinkedIn, Naukri, Indeed) + Direct ATS career alert domains</w:t>
             </w:r>
           </w:p>
         </w:tc>
@@ -3698,7 +3698,7 @@
                 <w:color w:val="334155"/>
                 <w:sz w:val="18"/>
               </w:rPr>
-              <w:t>job_digest/scoring.py</w:t>
+              <w:t>job_digest/match.py</w:t>
             </w:r>
           </w:p>
         </w:tc>
@@ -3748,7 +3748,7 @@
                 <w:color w:val="334155"/>
                 <w:sz w:val="18"/>
               </w:rPr>
-              <w:t>Applies hard knockout filters and calculates 10-point candidate suitability</w:t>
+              <w:t>Applies hard knockout filters, fresher exceptions, and 10-point scoring</w:t>
             </w:r>
           </w:p>
         </w:tc>
@@ -4133,7 +4133,7 @@
                 <w:color w:val="334155"/>
                 <w:sz w:val="18"/>
               </w:rPr>
-              <w:t>Defines seen_jobs, jobs, digests, source_runs, email_messages, job_sightings</w:t>
+              <w:t>Defines 8 tables: job_sources, seen_jobs, user_profiles, jobs, digests, source_runs, email_messages, job_sightings</w:t>
             </w:r>
           </w:p>
         </w:tc>
@@ -4210,7 +4210,7 @@
                 <w:color w:val="334155"/>
                 <w:sz w:val="18"/>
               </w:rPr>
-              <w:t>57 verified company boards for Greenhouse, Lever, Ashby, and SmartRecruiters</w:t>
+              <w:t>57 verified company boards for Greenhouse, Lever, Ashby, SmartRecruiters, and Workable</w:t>
             </w:r>
           </w:p>
         </w:tc>
@@ -4536,7 +4536,7 @@
           <w:color w:val="0F172A"/>
           <w:sz w:val="28"/>
         </w:rPr>
-        <w:t>5. Database Schema Architecture (6 Relational Tables)</w:t>
+        <w:t>5. Database Schema Architecture (8 Relational Tables)</w:t>
       </w:r>
     </w:p>
     <w:p>
@@ -4549,7 +4549,7 @@
           <w:color w:val="334155"/>
           <w:sz w:val="20"/>
         </w:rPr>
-        <w:t>The database runs on Neon Serverless PostgreSQL and comprises 6 tables with relational integrity:</w:t>
+        <w:t>The database runs on Neon Serverless PostgreSQL and comprises 8 tables with relational integrity:</w:t>
       </w:r>
     </w:p>
     <w:p>
@@ -4563,7 +4563,7 @@
           <w:color w:val="334155"/>
           <w:sz w:val="20"/>
         </w:rPr>
-        <w:t xml:space="preserve">1. seen_jobs: </w:t>
+        <w:t xml:space="preserve">1. job_sources: </w:t>
       </w:r>
       <w:r>
         <w:rPr>
@@ -4571,7 +4571,7 @@
           <w:color w:val="334155"/>
           <w:sz w:val="20"/>
         </w:rPr>
-        <w:t>Stores SHA-256 fingerprint, canonical URL, first_seen_at, last_seen_at, and candidate tracking status (new, saved, applied, dismissed).</w:t>
+        <w:t>Source configuration registry, types (ats, search_api, feed, imap), and active status flags.</w:t>
       </w:r>
     </w:p>
     <w:p>
@@ -4585,7 +4585,7 @@
           <w:color w:val="334155"/>
           <w:sz w:val="20"/>
         </w:rPr>
-        <w:t xml:space="preserve">2. jobs: </w:t>
+        <w:t xml:space="preserve">2. seen_jobs: </w:t>
       </w:r>
       <w:r>
         <w:rPr>
@@ -4593,7 +4593,7 @@
           <w:color w:val="334155"/>
           <w:sz w:val="20"/>
         </w:rPr>
-        <w:t>Stores full normalized job postings (title, company, location, description, salary_lpa, stipend, batch_years, matched_skills).</w:t>
+        <w:t>Master tracking store with fingerprint, canonical_url, first_seen_at, last_seen_at, notified_at, status, saved_at, applied_at, not_interested_at, and notes (powers yield analytics).</w:t>
       </w:r>
     </w:p>
     <w:p>
@@ -4607,7 +4607,7 @@
           <w:color w:val="334155"/>
           <w:sz w:val="20"/>
         </w:rPr>
-        <w:t xml:space="preserve">3. digests: </w:t>
+        <w:t xml:space="preserve">3. user_profiles: </w:t>
       </w:r>
       <w:r>
         <w:rPr>
@@ -4615,7 +4615,7 @@
           <w:color w:val="334155"/>
           <w:sz w:val="20"/>
         </w:rPr>
-        <w:t>Tracks historical records of morning and evening digests, total jobs selected, and delivered channels.</w:t>
+        <w:t>Versioned user profile configuration store (version, profile_yaml, profile_data, is_active, created_at) supporting ADR 007 profile evolution.</w:t>
       </w:r>
     </w:p>
     <w:p>
@@ -4629,7 +4629,7 @@
           <w:color w:val="334155"/>
           <w:sz w:val="20"/>
         </w:rPr>
-        <w:t xml:space="preserve">4. source_runs: </w:t>
+        <w:t xml:space="preserve">4. jobs: </w:t>
       </w:r>
       <w:r>
         <w:rPr>
@@ -4637,7 +4637,7 @@
           <w:color w:val="334155"/>
           <w:sz w:val="20"/>
         </w:rPr>
-        <w:t>Logs execution status, raw jobs found, error messages, and response latency per adapter.</w:t>
+        <w:t>Stores full normalized job postings (title, company, location, description, salary_lpa, stipend, batch_years, matched_skills, score, breakdown).</w:t>
       </w:r>
     </w:p>
     <w:p>
@@ -4651,7 +4651,51 @@
           <w:color w:val="334155"/>
           <w:sz w:val="20"/>
         </w:rPr>
-        <w:t xml:space="preserve">5. email_messages: </w:t>
+        <w:t xml:space="preserve">5. digests: </w:t>
+      </w:r>
+      <w:r>
+        <w:rPr>
+          <w:rFonts w:ascii="Calibri" w:hAnsi="Calibri"/>
+          <w:color w:val="334155"/>
+          <w:sz w:val="20"/>
+        </w:rPr>
+        <w:t>Historical record of morning and evening digests, total jobs, channel notification status, and rendered HTML/text.</w:t>
+      </w:r>
+    </w:p>
+    <w:p>
+      <w:pPr>
+        <w:spacing w:before="0" w:after="80" w:line="276" w:lineRule="auto"/>
+      </w:pPr>
+      <w:r>
+        <w:rPr>
+          <w:rFonts w:ascii="Calibri" w:hAnsi="Calibri"/>
+          <w:b/>
+          <w:color w:val="334155"/>
+          <w:sz w:val="20"/>
+        </w:rPr>
+        <w:t xml:space="preserve">6. source_runs: </w:t>
+      </w:r>
+      <w:r>
+        <w:rPr>
+          <w:rFonts w:ascii="Calibri" w:hAnsi="Calibri"/>
+          <w:color w:val="334155"/>
+          <w:sz w:val="20"/>
+        </w:rPr>
+        <w:t>Logs execution status, raw jobs found, error messages, and response latency per adapter (renders /sources dashboard).</w:t>
+      </w:r>
+    </w:p>
+    <w:p>
+      <w:pPr>
+        <w:spacing w:before="0" w:after="80" w:line="276" w:lineRule="auto"/>
+      </w:pPr>
+      <w:r>
+        <w:rPr>
+          <w:rFonts w:ascii="Calibri" w:hAnsi="Calibri"/>
+          <w:b/>
+          <w:color w:val="334155"/>
+          <w:sz w:val="20"/>
+        </w:rPr>
+        <w:t xml:space="preserve">7. email_messages: </w:t>
       </w:r>
       <w:r>
         <w:rPr>
@@ -4673,7 +4717,7 @@
           <w:color w:val="334155"/>
           <w:sz w:val="20"/>
         </w:rPr>
-        <w:t xml:space="preserve">6. job_sightings: </w:t>
+        <w:t xml:space="preserve">8. job_sightings: </w:t>
       </w:r>
       <w:r>
         <w:rPr>
@@ -4681,7 +4725,7 @@
           <w:color w:val="334155"/>
           <w:sz w:val="20"/>
         </w:rPr>
-        <w:t>Tracks multi-source attribution (fingerprint, source, seen_at). Powers the 7-day source yield dashboard, calculating exclusive roles and application conversion rates.</w:t>
+        <w:t>Tracks multi-source sightings per fingerprint. Powers the 7-day source yield dashboard, calculating exclusive roles and application conversion rates.</w:t>
       </w:r>
     </w:p>
     <w:p>
@@ -4697,6 +4741,28 @@
           <w:sz w:val="28"/>
         </w:rPr>
         <w:t>6. 10-Point Scoring Algorithm &amp; Knockout Rules</w:t>
+      </w:r>
+    </w:p>
+    <w:p>
+      <w:pPr>
+        <w:spacing w:before="0" w:after="80" w:line="276" w:lineRule="auto"/>
+      </w:pPr>
+      <w:r>
+        <w:rPr>
+          <w:rFonts w:ascii="Calibri" w:hAnsi="Calibri"/>
+          <w:b/>
+          <w:color w:val="334155"/>
+          <w:sz w:val="20"/>
+        </w:rPr>
+        <w:t xml:space="preserve">• Seniority Rules &amp; Exception Guard: </w:t>
+      </w:r>
+      <w:r>
+        <w:rPr>
+          <w:rFonts w:ascii="Calibri" w:hAnsi="Calibri"/>
+          <w:color w:val="334155"/>
+          <w:sz w:val="20"/>
+        </w:rPr>
+        <w:t>Seniority knockout strictly excludes Senior, Lead, Principal, Staff, Architect, Manager, Director. Built-in exception guard ensures intern and trainee roles (e.g. 'Product Manager Intern', 'Lead Generation Trainee') are NOT knocked out on role-level words.</w:t>
       </w:r>
     </w:p>
     <w:tbl>
@@ -4786,7 +4852,7 @@
                 <w:color w:val="FFFFFF"/>
                 <w:sz w:val="19"/>
               </w:rPr>
-              <w:t>Evaluation Logic</w:t>
+              <w:t>Evaluation &amp; Graduated Scoring Logic</w:t>
             </w:r>
           </w:p>
         </w:tc>
@@ -4863,7 +4929,15 @@
                 <w:color w:val="334155"/>
                 <w:sz w:val="18"/>
               </w:rPr>
-              <w:t>Matches candidate skills (Python, FastAPI, SQL, React, Linux, Docker). 4+ = 4.0; 3 = 3.0; 2 = 2.0; 1 = 1.0</w:t>
+              <w:t>Matches candidate skills (Python, FastAPI, SQL, React, Linux, Docker, etc.):</w:t>
+              <w:br/>
+              <w:t>• 4+ matches: 1.0 × 4.0 = 4.0 pts</w:t>
+              <w:br/>
+              <w:t>• 3 matches: 0.8 × 4.0 = 3.2 pts</w:t>
+              <w:br/>
+              <w:t>• 2 matches: 0.6 × 4.0 = 2.4 pts</w:t>
+              <w:br/>
+              <w:t>• 1 match: 0.4 × 4.0 = 1.6 pts</w:t>
             </w:r>
           </w:p>
         </w:tc>
@@ -5171,7 +5245,11 @@
                 <w:color w:val="334155"/>
                 <w:sz w:val="18"/>
               </w:rPr>
-              <w:t>Default notification threshold is &gt;= 7.0 / 10 points (customizable via dashboard)</w:t>
+              <w:t>• Strong Matches (&gt;= 7.0 pts): High-conviction delivery</w:t>
+              <w:br/>
+              <w:t>• Maybe Matches (4.0 - 6.9 pts): Secondary curated bucket in digest</w:t>
+              <w:br/>
+              <w:t>• Below 4.0 pts: Discarded</w:t>
             </w:r>
           </w:p>
         </w:tc>

</xml_diff>